<commit_message>
Minor edits to Piece 3 (mostly position)
</commit_message>
<xml_diff>
--- a/Working Folder/[In Progress] 3 Zhu Yi Qing 朱一清 - The Silence of Borobudur 沉默的婆罗浮屠/3 The Silence of Borobudur 沉默的婆罗浮屠 - Errata_v1.docx
+++ b/Working Folder/[In Progress] 3 Zhu Yi Qing 朱一清 - The Silence of Borobudur 沉默的婆罗浮屠/3 The Silence of Borobudur 沉默的婆罗浮屠 - Errata_v1.docx
@@ -207,7 +207,7 @@
       <w:pPr>
         <w:jc w:val="both"/>
         <w:rPr>
-          <w:rFonts w:ascii="Times New Roman" w:hAnsi="Times New Roman" w:cs="Times New Roman" w:hint="eastAsia"/>
+          <w:rFonts w:ascii="Times New Roman" w:hAnsi="Times New Roman" w:cs="Times New Roman"/>
           <w:bCs/>
           <w:sz w:val="32"/>
           <w:szCs w:val="32"/>
@@ -1047,16 +1047,16 @@
             <w:proofErr w:type="spellStart"/>
             <w:r>
               <w:rPr>
-                <w:rFonts w:ascii="Times New Roman" w:hAnsi="Times New Roman" w:cs="Times New Roman" w:hint="eastAsia"/>
+                <w:rFonts w:ascii="Times New Roman" w:hAnsi="Times New Roman" w:cs="Times New Roman"/>
               </w:rPr>
               <w:t>Mvt</w:t>
             </w:r>
             <w:proofErr w:type="spellEnd"/>
             <w:r>
               <w:rPr>
-                <w:rFonts w:ascii="Times New Roman" w:hAnsi="Times New Roman" w:cs="Times New Roman" w:hint="eastAsia"/>
-              </w:rPr>
-              <w:t xml:space="preserve"> 2 - 83</w:t>
+                <w:rFonts w:ascii="Times New Roman" w:hAnsi="Times New Roman" w:cs="Times New Roman"/>
+              </w:rPr>
+              <w:t xml:space="preserve"> 1 - 11</w:t>
             </w:r>
           </w:p>
         </w:tc>
@@ -1075,87 +1075,57 @@
               <w:rPr>
                 <w:rFonts w:ascii="Times New Roman" w:hAnsi="Times New Roman" w:cs="Times New Roman"/>
               </w:rPr>
-              <w:t>Woodblock</w:t>
+              <w:t>Pipa solo</w:t>
             </w:r>
           </w:p>
-          <w:p>
-            <w:pPr>
-              <w:jc w:val="center"/>
-              <w:rPr>
-                <w:rFonts w:ascii="Times New Roman" w:hAnsi="Times New Roman" w:cs="Times New Roman"/>
-              </w:rPr>
-            </w:pPr>
+        </w:tc>
+        <w:tc>
+          <w:tcPr>
+            <w:tcW w:w="3260" w:type="dxa"/>
+          </w:tcPr>
+          <w:p>
+            <w:pPr>
+              <w:rPr>
+                <w:rFonts w:ascii="Times New Roman" w:hAnsi="Times New Roman" w:cs="Times New Roman"/>
+              </w:rPr>
+            </w:pPr>
+            <w:proofErr w:type="spellStart"/>
             <w:r>
               <w:rPr>
-                <w:rFonts w:ascii="Times New Roman" w:hAnsi="Times New Roman" w:cs="Times New Roman" w:hint="eastAsia"/>
-              </w:rPr>
-              <w:t>木鱼</w:t>
+                <w:rFonts w:ascii="Times New Roman" w:hAnsi="Times New Roman" w:cs="Times New Roman"/>
+              </w:rPr>
+              <w:t>Decresc</w:t>
             </w:r>
-          </w:p>
-        </w:tc>
-        <w:tc>
-          <w:tcPr>
-            <w:tcW w:w="3260" w:type="dxa"/>
-          </w:tcPr>
-          <w:p>
-            <w:pPr>
-              <w:rPr>
-                <w:rFonts w:ascii="Times New Roman" w:hAnsi="Times New Roman" w:cs="Times New Roman" w:hint="eastAsia"/>
-              </w:rPr>
-            </w:pPr>
+            <w:proofErr w:type="spellEnd"/>
             <w:r>
               <w:rPr>
                 <w:rFonts w:ascii="Times New Roman" w:hAnsi="Times New Roman" w:cs="Times New Roman"/>
               </w:rPr>
-              <w:t>Added “</w:t>
+              <w:t xml:space="preserve">. to </w:t>
+            </w:r>
+            <w:proofErr w:type="gramStart"/>
+            <w:r>
+              <w:rPr>
+                <w:rFonts w:ascii="Times New Roman" w:hAnsi="Times New Roman" w:cs="Times New Roman"/>
+                <w:b/>
+                <w:bCs/>
+                <w:i/>
+                <w:iCs/>
+              </w:rPr>
+              <w:t>ff</w:t>
             </w:r>
             <w:r>
               <w:rPr>
-                <w:rFonts w:ascii="Times New Roman" w:hAnsi="Times New Roman" w:cs="Times New Roman" w:hint="eastAsia"/>
-              </w:rPr>
-              <w:t>(</w:t>
+                <w:rFonts w:ascii="Times New Roman" w:hAnsi="Times New Roman" w:cs="Times New Roman"/>
+              </w:rPr>
+              <w:t xml:space="preserve"> ?</w:t>
             </w:r>
+            <w:proofErr w:type="gramEnd"/>
             <w:r>
               <w:rPr>
-                <w:rFonts w:ascii="Times New Roman" w:hAnsi="Times New Roman" w:cs="Times New Roman" w:hint="eastAsia"/>
-              </w:rPr>
-              <w:t>西方</w:t>
-            </w:r>
-            <w:r>
-              <w:rPr>
-                <w:rFonts w:ascii="Times New Roman" w:hAnsi="Times New Roman" w:cs="Times New Roman" w:hint="eastAsia"/>
-              </w:rPr>
-              <w:t>)</w:t>
-            </w:r>
-            <w:r>
-              <w:rPr>
-                <w:rFonts w:ascii="Times New Roman" w:hAnsi="Times New Roman" w:cs="Times New Roman"/>
-              </w:rPr>
-              <w:t>”</w:t>
-            </w:r>
-            <w:r>
-              <w:rPr>
-                <w:rFonts w:ascii="Times New Roman" w:hAnsi="Times New Roman" w:cs="Times New Roman" w:hint="eastAsia"/>
-              </w:rPr>
-              <w:t xml:space="preserve"> to indicate it is a </w:t>
-            </w:r>
-            <w:r>
-              <w:rPr>
-                <w:rFonts w:ascii="Times New Roman" w:hAnsi="Times New Roman" w:cs="Times New Roman"/>
-              </w:rPr>
-              <w:t>“</w:t>
-            </w:r>
-            <w:r>
-              <w:rPr>
-                <w:rFonts w:ascii="Times New Roman" w:hAnsi="Times New Roman" w:cs="Times New Roman" w:hint="eastAsia"/>
-              </w:rPr>
-              <w:t>western woodblock</w:t>
-            </w:r>
-            <w:r>
-              <w:rPr>
-                <w:rFonts w:ascii="Times New Roman" w:hAnsi="Times New Roman" w:cs="Times New Roman"/>
-              </w:rPr>
-              <w:t>”</w:t>
+                <w:rFonts w:ascii="Times New Roman" w:hAnsi="Times New Roman" w:cs="Times New Roman"/>
+              </w:rPr>
+              <w:t xml:space="preserve"> </w:t>
             </w:r>
           </w:p>
         </w:tc>
@@ -1187,7 +1157,7 @@
             <w:pPr>
               <w:jc w:val="center"/>
               <w:rPr>
-                <w:rFonts w:ascii="Times New Roman" w:hAnsi="Times New Roman" w:cs="Times New Roman" w:hint="eastAsia"/>
+                <w:rFonts w:ascii="Times New Roman" w:hAnsi="Times New Roman" w:cs="Times New Roman"/>
               </w:rPr>
             </w:pPr>
             <w:proofErr w:type="spellStart"/>
@@ -1202,74 +1172,106 @@
               <w:rPr>
                 <w:rFonts w:ascii="Times New Roman" w:hAnsi="Times New Roman" w:cs="Times New Roman" w:hint="eastAsia"/>
               </w:rPr>
-              <w:t xml:space="preserve"> 2 </w:t>
+              <w:t xml:space="preserve"> 2 - 83</w:t>
+            </w:r>
+          </w:p>
+        </w:tc>
+        <w:tc>
+          <w:tcPr>
+            <w:tcW w:w="1985" w:type="dxa"/>
+          </w:tcPr>
+          <w:p>
+            <w:pPr>
+              <w:jc w:val="center"/>
+              <w:rPr>
+                <w:rFonts w:ascii="Times New Roman" w:hAnsi="Times New Roman" w:cs="Times New Roman"/>
+              </w:rPr>
+            </w:pPr>
+            <w:r>
+              <w:rPr>
+                <w:rFonts w:ascii="Times New Roman" w:hAnsi="Times New Roman" w:cs="Times New Roman"/>
+              </w:rPr>
+              <w:t>Woodblock</w:t>
+            </w:r>
+          </w:p>
+          <w:p>
+            <w:pPr>
+              <w:jc w:val="center"/>
+              <w:rPr>
+                <w:rFonts w:ascii="Times New Roman" w:hAnsi="Times New Roman" w:cs="Times New Roman"/>
+              </w:rPr>
+            </w:pPr>
+            <w:r>
+              <w:rPr>
+                <w:rFonts w:ascii="Times New Roman" w:hAnsi="Times New Roman" w:cs="Times New Roman" w:hint="eastAsia"/>
+              </w:rPr>
+              <w:t>木鱼</w:t>
+            </w:r>
+          </w:p>
+        </w:tc>
+        <w:tc>
+          <w:tcPr>
+            <w:tcW w:w="3260" w:type="dxa"/>
+          </w:tcPr>
+          <w:p>
+            <w:pPr>
+              <w:rPr>
+                <w:rFonts w:ascii="Times New Roman" w:hAnsi="Times New Roman" w:cs="Times New Roman"/>
+              </w:rPr>
+            </w:pPr>
+            <w:r>
+              <w:rPr>
+                <w:rFonts w:ascii="Times New Roman" w:hAnsi="Times New Roman" w:cs="Times New Roman"/>
+              </w:rPr>
+              <w:t>Added “</w:t>
             </w:r>
             <w:r>
               <w:rPr>
-                <w:rFonts w:ascii="Times New Roman" w:hAnsi="Times New Roman" w:cs="Times New Roman"/>
-              </w:rPr>
-              <w:t>–</w:t>
+                <w:rFonts w:ascii="Times New Roman" w:hAnsi="Times New Roman" w:cs="Times New Roman" w:hint="eastAsia"/>
+              </w:rPr>
+              <w:t>(</w:t>
             </w:r>
             <w:r>
               <w:rPr>
                 <w:rFonts w:ascii="Times New Roman" w:hAnsi="Times New Roman" w:cs="Times New Roman" w:hint="eastAsia"/>
               </w:rPr>
-              <w:t xml:space="preserve"> </w:t>
+              <w:t>西方</w:t>
             </w:r>
             <w:r>
               <w:rPr>
                 <w:rFonts w:ascii="Times New Roman" w:hAnsi="Times New Roman" w:cs="Times New Roman" w:hint="eastAsia"/>
               </w:rPr>
-              <w:t>130</w:t>
+              <w:t>)</w:t>
             </w:r>
             <w:r>
               <w:rPr>
                 <w:rFonts w:ascii="Times New Roman" w:hAnsi="Times New Roman" w:cs="Times New Roman"/>
               </w:rPr>
-              <w:t>-145</w:t>
-            </w:r>
-          </w:p>
-        </w:tc>
-        <w:tc>
-          <w:tcPr>
-            <w:tcW w:w="1985" w:type="dxa"/>
-          </w:tcPr>
-          <w:p>
-            <w:pPr>
-              <w:jc w:val="center"/>
-              <w:rPr>
-                <w:rFonts w:ascii="Times New Roman" w:hAnsi="Times New Roman" w:cs="Times New Roman" w:hint="eastAsia"/>
-              </w:rPr>
-            </w:pPr>
-            <w:r>
-              <w:rPr>
-                <w:rFonts w:ascii="Times New Roman" w:hAnsi="Times New Roman" w:cs="Times New Roman" w:hint="eastAsia"/>
-              </w:rPr>
-              <w:t>Perc IV</w:t>
-            </w:r>
-          </w:p>
-        </w:tc>
-        <w:tc>
-          <w:tcPr>
-            <w:tcW w:w="3260" w:type="dxa"/>
-          </w:tcPr>
-          <w:p>
-            <w:pPr>
-              <w:rPr>
-                <w:rFonts w:ascii="Times New Roman" w:hAnsi="Times New Roman" w:cs="Times New Roman" w:hint="eastAsia"/>
-              </w:rPr>
-            </w:pPr>
-            <w:r>
-              <w:rPr>
-                <w:rFonts w:ascii="Times New Roman" w:hAnsi="Times New Roman" w:cs="Times New Roman"/>
-              </w:rPr>
-              <w:t>No indication as to what instrument is playing this</w:t>
+              <w:t>”</w:t>
             </w:r>
             <w:r>
               <w:rPr>
                 <w:rFonts w:ascii="Times New Roman" w:hAnsi="Times New Roman" w:cs="Times New Roman" w:hint="eastAsia"/>
               </w:rPr>
-              <w:t>.</w:t>
+              <w:t xml:space="preserve"> to indicate it is a </w:t>
+            </w:r>
+            <w:r>
+              <w:rPr>
+                <w:rFonts w:ascii="Times New Roman" w:hAnsi="Times New Roman" w:cs="Times New Roman"/>
+              </w:rPr>
+              <w:t>“</w:t>
+            </w:r>
+            <w:r>
+              <w:rPr>
+                <w:rFonts w:ascii="Times New Roman" w:hAnsi="Times New Roman" w:cs="Times New Roman" w:hint="eastAsia"/>
+              </w:rPr>
+              <w:t>western woodblock</w:t>
+            </w:r>
+            <w:r>
+              <w:rPr>
+                <w:rFonts w:ascii="Times New Roman" w:hAnsi="Times New Roman" w:cs="Times New Roman"/>
+              </w:rPr>
+              <w:t>”</w:t>
             </w:r>
           </w:p>
         </w:tc>
@@ -1301,9 +1303,41 @@
             <w:pPr>
               <w:jc w:val="center"/>
               <w:rPr>
+                <w:rFonts w:ascii="Times New Roman" w:hAnsi="Times New Roman" w:cs="Times New Roman"/>
+              </w:rPr>
+            </w:pPr>
+            <w:proofErr w:type="spellStart"/>
+            <w:r>
+              <w:rPr>
                 <w:rFonts w:ascii="Times New Roman" w:hAnsi="Times New Roman" w:cs="Times New Roman" w:hint="eastAsia"/>
               </w:rPr>
-            </w:pPr>
+              <w:t>Mvt</w:t>
+            </w:r>
+            <w:proofErr w:type="spellEnd"/>
+            <w:r>
+              <w:rPr>
+                <w:rFonts w:ascii="Times New Roman" w:hAnsi="Times New Roman" w:cs="Times New Roman" w:hint="eastAsia"/>
+              </w:rPr>
+              <w:t xml:space="preserve"> 2 </w:t>
+            </w:r>
+            <w:r>
+              <w:rPr>
+                <w:rFonts w:ascii="Times New Roman" w:hAnsi="Times New Roman" w:cs="Times New Roman"/>
+              </w:rPr>
+              <w:t>–</w:t>
+            </w:r>
+            <w:r>
+              <w:rPr>
+                <w:rFonts w:ascii="Times New Roman" w:hAnsi="Times New Roman" w:cs="Times New Roman" w:hint="eastAsia"/>
+              </w:rPr>
+              <w:t xml:space="preserve"> 130</w:t>
+            </w:r>
+            <w:r>
+              <w:rPr>
+                <w:rFonts w:ascii="Times New Roman" w:hAnsi="Times New Roman" w:cs="Times New Roman"/>
+              </w:rPr>
+              <w:t>-145</w:t>
+            </w:r>
           </w:p>
         </w:tc>
         <w:tc>
@@ -1315,6 +1349,82 @@
               <w:jc w:val="center"/>
               <w:rPr>
                 <w:rFonts w:ascii="Times New Roman" w:hAnsi="Times New Roman" w:cs="Times New Roman"/>
+              </w:rPr>
+            </w:pPr>
+            <w:r>
+              <w:rPr>
+                <w:rFonts w:ascii="Times New Roman" w:hAnsi="Times New Roman" w:cs="Times New Roman" w:hint="eastAsia"/>
+              </w:rPr>
+              <w:t>Perc IV</w:t>
+            </w:r>
+          </w:p>
+        </w:tc>
+        <w:tc>
+          <w:tcPr>
+            <w:tcW w:w="3260" w:type="dxa"/>
+          </w:tcPr>
+          <w:p>
+            <w:pPr>
+              <w:rPr>
+                <w:rFonts w:ascii="Times New Roman" w:hAnsi="Times New Roman" w:cs="Times New Roman"/>
+              </w:rPr>
+            </w:pPr>
+            <w:r>
+              <w:rPr>
+                <w:rFonts w:ascii="Times New Roman" w:hAnsi="Times New Roman" w:cs="Times New Roman"/>
+              </w:rPr>
+              <w:t>No indication as to what instrument is playing this</w:t>
+            </w:r>
+            <w:r>
+              <w:rPr>
+                <w:rFonts w:ascii="Times New Roman" w:hAnsi="Times New Roman" w:cs="Times New Roman" w:hint="eastAsia"/>
+              </w:rPr>
+              <w:t>.</w:t>
+            </w:r>
+          </w:p>
+        </w:tc>
+        <w:tc>
+          <w:tcPr>
+            <w:tcW w:w="2711" w:type="dxa"/>
+            <w:vAlign w:val="center"/>
+          </w:tcPr>
+          <w:p>
+            <w:pPr>
+              <w:jc w:val="center"/>
+              <w:rPr>
+                <w:rFonts w:ascii="Times New Roman" w:hAnsi="Times New Roman" w:cs="Times New Roman"/>
+                <w:color w:val="FF0000"/>
+              </w:rPr>
+            </w:pPr>
+          </w:p>
+        </w:tc>
+      </w:tr>
+      <w:tr>
+        <w:trPr>
+          <w:trHeight w:val="552"/>
+        </w:trPr>
+        <w:tc>
+          <w:tcPr>
+            <w:tcW w:w="1129" w:type="dxa"/>
+          </w:tcPr>
+          <w:p>
+            <w:pPr>
+              <w:jc w:val="center"/>
+              <w:rPr>
+                <w:rFonts w:ascii="Times New Roman" w:hAnsi="Times New Roman" w:cs="Times New Roman"/>
+              </w:rPr>
+            </w:pPr>
+          </w:p>
+        </w:tc>
+        <w:tc>
+          <w:tcPr>
+            <w:tcW w:w="1985" w:type="dxa"/>
+          </w:tcPr>
+          <w:p>
+            <w:pPr>
+              <w:jc w:val="center"/>
+              <w:rPr>
+                <w:rFonts w:ascii="Times New Roman" w:hAnsi="Times New Roman" w:cs="Times New Roman"/>
                 <w:lang w:val="en-GB"/>
               </w:rPr>
             </w:pPr>
@@ -1327,7 +1437,7 @@
           <w:p>
             <w:pPr>
               <w:rPr>
-                <w:rFonts w:ascii="Times New Roman" w:hAnsi="Times New Roman" w:cs="Times New Roman" w:hint="eastAsia"/>
+                <w:rFonts w:ascii="Times New Roman" w:hAnsi="Times New Roman" w:cs="Times New Roman"/>
               </w:rPr>
             </w:pPr>
           </w:p>
@@ -3557,6 +3667,7 @@
   <w:style w:type="character" w:default="1" w:styleId="DefaultParagraphFont">
     <w:name w:val="Default Paragraph Font"/>
     <w:uiPriority w:val="1"/>
+    <w:semiHidden/>
     <w:unhideWhenUsed/>
   </w:style>
   <w:style w:type="table" w:default="1" w:styleId="TableNormal">

</xml_diff>